<commit_message>
TSTI2D3 : TP CO₂ non noté, calculs guidés, passage en MicroPython sur ESP32 (démarrage en 5 s au lieu de 70 s) ; docx : conversion des formules corrigée
Co-Authored-By: Claude Opus 5.5 <noreply@anthropic.com>
</commit_message>
<xml_diff>
--- a/output/Term_STI2D_SIN/T1_Capteurs_et_CAN/eleve/REPONSES_AUTO_TermSIN_CO2_Wokwi.docx
+++ b/output/Term_STI2D_SIN/T1_Capteurs_et_CAN/eleve/REPONSES_AUTO_TermSIN_CO2_Wokwi.docx
@@ -142,6 +142,46 @@
       <w:r>
         <w:rPr>
           <w:rFonts w:ascii="Arial" w:cs="Arial" w:eastAsia="Arial" w:hAnsi="Arial"/>
+          <w:i/>
+          <w:iCs/>
+          <w:color w:val="64748B"/>
+          <w:sz w:val="21"/>
+          <w:szCs w:val="21"/>
+        </w:rPr>
+        <w:t xml:space="preserve">Même méthode pour le </w:t>
+      </w:r>
+      <w:r>
+        <w:rPr>
+          <w:rFonts w:ascii="Arial" w:cs="Arial" w:eastAsia="Arial" w:hAnsi="Arial"/>
+          <w:b/>
+          <w:bCs/>
+          <w:i/>
+          <w:iCs/>
+          <w:color w:val="64748B"/>
+          <w:sz w:val="21"/>
+          <w:szCs w:val="21"/>
+        </w:rPr>
+        <w:t xml:space="preserve">capteur de CO₂</w:t>
+      </w:r>
+      <w:r>
+        <w:rPr>
+          <w:rFonts w:ascii="Arial" w:cs="Arial" w:eastAsia="Arial" w:hAnsi="Arial"/>
+          <w:i/>
+          <w:iCs/>
+          <w:color w:val="64748B"/>
+          <w:sz w:val="21"/>
+          <w:szCs w:val="21"/>
+        </w:rPr>
+        <w:t xml:space="preserve"> du DR1 (0 V pour 0 ppm, 3,0 V pour 2 000 ppm). Recopie et complète :</w:t>
+      </w:r>
+    </w:p>
+    <w:p>
+      <w:pPr>
+        <w:spacing w:after="60"/>
+      </w:pPr>
+      <w:r>
+        <w:rPr>
+          <w:rFonts w:ascii="Arial" w:cs="Arial" w:eastAsia="Arial" w:hAnsi="Arial"/>
           <w:b/>
           <w:bCs/>
           <w:i/>
@@ -161,31 +201,7 @@
           <w:sz w:val="21"/>
           <w:szCs w:val="21"/>
         </w:rPr>
-        <w:t xml:space="preserve"> Calculer la </w:t>
-      </w:r>
-      <w:r>
-        <w:rPr>
-          <w:rFonts w:ascii="Arial" w:cs="Arial" w:eastAsia="Arial" w:hAnsi="Arial"/>
-          <w:b/>
-          <w:bCs/>
-          <w:i/>
-          <w:iCs/>
-          <w:color w:val="64748B"/>
-          <w:sz w:val="21"/>
-          <w:szCs w:val="21"/>
-        </w:rPr>
-        <w:t xml:space="preserve">sensibilité</w:t>
-      </w:r>
-      <w:r>
-        <w:rPr>
-          <w:rFonts w:ascii="Arial" w:cs="Arial" w:eastAsia="Arial" w:hAnsi="Arial"/>
-          <w:i/>
-          <w:iCs/>
-          <w:color w:val="64748B"/>
-          <w:sz w:val="21"/>
-          <w:szCs w:val="21"/>
-        </w:rPr>
-        <w:t xml:space="preserve"> s du capteur, en V/ppm puis en mV/ppm.</w:t>
+        <w:t xml:space="preserve"> Variation de tension : ΔV = … − … = … V</w:t>
       </w:r>
     </w:p>
     <w:p>
@@ -214,7 +230,65 @@
           <w:sz w:val="21"/>
           <w:szCs w:val="21"/>
         </w:rPr>
-        <w:t xml:space="preserve"> Calculer la tension de sortie du capteur dans l'air extérieur (420 ppm), puis au seuil d'alerte (1 500 ppm).</w:t>
+        <w:t xml:space="preserve"> Variation de concentration : ΔC = … − … = … ppm</w:t>
+      </w:r>
+    </w:p>
+    <w:p>
+      <w:pPr>
+        <w:spacing w:after="60"/>
+      </w:pPr>
+      <w:r>
+        <w:rPr>
+          <w:rFonts w:ascii="Arial" w:cs="Arial" w:eastAsia="Arial" w:hAnsi="Arial"/>
+          <w:b/>
+          <w:bCs/>
+          <w:i/>
+          <w:iCs/>
+          <w:color w:val="64748B"/>
+          <w:sz w:val="21"/>
+          <w:szCs w:val="21"/>
+        </w:rPr>
+        <w:t xml:space="preserve">c)</w:t>
+      </w:r>
+      <w:r>
+        <w:rPr>
+          <w:rFonts w:ascii="Arial" w:cs="Arial" w:eastAsia="Arial" w:hAnsi="Arial"/>
+          <w:i/>
+          <w:iCs/>
+          <w:color w:val="64748B"/>
+          <w:sz w:val="21"/>
+          <w:szCs w:val="21"/>
+        </w:rPr>
+        <w:t xml:space="preserve"> Sensibilité : s = ΔV / ΔC = … V/ppm, soit … mV/ppm</w:t>
+      </w:r>
+    </w:p>
+    <w:p>
+      <w:pPr>
+        <w:spacing w:after="60"/>
+      </w:pPr>
+      <w:r>
+        <w:rPr>
+          <w:rFonts w:ascii="Arial" w:cs="Arial" w:eastAsia="Arial" w:hAnsi="Arial"/>
+          <w:b/>
+          <w:bCs/>
+          <w:i/>
+          <w:iCs/>
+          <w:color w:val="64748B"/>
+          <w:sz w:val="21"/>
+          <w:szCs w:val="21"/>
+        </w:rPr>
+        <w:t xml:space="preserve">d)</w:t>
+      </w:r>
+      <w:r>
+        <w:rPr>
+          <w:rFonts w:ascii="Arial" w:cs="Arial" w:eastAsia="Arial" w:hAnsi="Arial"/>
+          <w:i/>
+          <w:iCs/>
+          <w:color w:val="64748B"/>
+          <w:sz w:val="21"/>
+          <w:szCs w:val="21"/>
+        </w:rPr>
+        <w:t xml:space="preserve"> Tension dans l'air extérieur (420 ppm) : V = s × C = … V. Puis au seuil d'alerte (1 500 ppm) : V = … V</w:t>
       </w:r>
     </w:p>
     <w:p>
@@ -305,6 +379,70 @@
       <w:r>
         <w:rPr>
           <w:rFonts w:ascii="Arial" w:cs="Arial" w:eastAsia="Arial" w:hAnsi="Arial"/>
+          <w:i/>
+          <w:iCs/>
+          <w:color w:val="64748B"/>
+          <w:sz w:val="21"/>
+          <w:szCs w:val="21"/>
+        </w:rPr>
+        <w:t xml:space="preserve">Le CAN de l'ESP32 a </w:t>
+      </w:r>
+      <w:r>
+        <w:rPr>
+          <w:rFonts w:ascii="Arial" w:cs="Arial" w:eastAsia="Arial" w:hAnsi="Arial"/>
+          <w:b/>
+          <w:bCs/>
+          <w:i/>
+          <w:iCs/>
+          <w:color w:val="64748B"/>
+          <w:sz w:val="21"/>
+          <w:szCs w:val="21"/>
+        </w:rPr>
+        <w:t xml:space="preserve">12 bits</w:t>
+      </w:r>
+      <w:r>
+        <w:rPr>
+          <w:rFonts w:ascii="Arial" w:cs="Arial" w:eastAsia="Arial" w:hAnsi="Arial"/>
+          <w:i/>
+          <w:iCs/>
+          <w:color w:val="64748B"/>
+          <w:sz w:val="21"/>
+          <w:szCs w:val="21"/>
+        </w:rPr>
+        <w:t xml:space="preserve"> et une pleine échelle </w:t>
+      </w:r>
+      <w:r>
+        <w:rPr>
+          <w:rFonts w:ascii="Arial" w:cs="Arial" w:eastAsia="Arial" w:hAnsi="Arial"/>
+          <w:b/>
+          <w:bCs/>
+          <w:i/>
+          <w:iCs/>
+          <w:color w:val="64748B"/>
+          <w:sz w:val="21"/>
+          <w:szCs w:val="21"/>
+        </w:rPr>
+        <w:t xml:space="preserve">PE = 3,3 V</w:t>
+      </w:r>
+      <w:r>
+        <w:rPr>
+          <w:rFonts w:ascii="Arial" w:cs="Arial" w:eastAsia="Arial" w:hAnsi="Arial"/>
+          <w:i/>
+          <w:iCs/>
+          <w:color w:val="64748B"/>
+          <w:sz w:val="21"/>
+          <w:szCs w:val="21"/>
+        </w:rPr>
+        <w:t xml:space="preserve"> (DR1). Recopie et complète :</w:t>
+      </w:r>
+    </w:p>
+    <w:p>
+      <w:pPr>
+        <w:spacing w:after="60"/>
+      </w:pPr>
+      <w:r>
+        <w:rPr>
+          <w:rFonts w:ascii="Arial" w:cs="Arial" w:eastAsia="Arial" w:hAnsi="Arial"/>
           <w:b/>
           <w:bCs/>
           <w:i/>
@@ -324,7 +462,7 @@
           <w:sz w:val="21"/>
           <w:szCs w:val="21"/>
         </w:rPr>
-        <w:t xml:space="preserve"> Calculer le quantum q du CAN de l'Arduino Uno.</w:t>
+        <w:t xml:space="preserve"> Nombre de codes : 2¹² = … ; code maximal : 2¹² - 1 = …</w:t>
       </w:r>
     </w:p>
     <w:p>
@@ -353,7 +491,36 @@
           <w:sz w:val="21"/>
           <w:szCs w:val="21"/>
         </w:rPr>
-        <w:t xml:space="preserve"> En déduire le code N que le CAN doit fournir au seuil d'alerte (1 500 ppm).</w:t>
+        <w:t xml:space="preserve"> Quantum : q = PE / 2¹² = 3,3 / … = … V, soit … mV</w:t>
+      </w:r>
+    </w:p>
+    <w:p>
+      <w:pPr>
+        <w:spacing w:after="60"/>
+      </w:pPr>
+      <w:r>
+        <w:rPr>
+          <w:rFonts w:ascii="Arial" w:cs="Arial" w:eastAsia="Arial" w:hAnsi="Arial"/>
+          <w:b/>
+          <w:bCs/>
+          <w:i/>
+          <w:iCs/>
+          <w:color w:val="64748B"/>
+          <w:sz w:val="21"/>
+          <w:szCs w:val="21"/>
+        </w:rPr>
+        <w:t xml:space="preserve">c)</w:t>
+      </w:r>
+      <w:r>
+        <w:rPr>
+          <w:rFonts w:ascii="Arial" w:cs="Arial" w:eastAsia="Arial" w:hAnsi="Arial"/>
+          <w:i/>
+          <w:iCs/>
+          <w:color w:val="64748B"/>
+          <w:sz w:val="21"/>
+          <w:szCs w:val="21"/>
+        </w:rPr>
+        <w:t xml:space="preserve"> Code au seuil d'alerte (2,25 V, question 1d) : V / q = 2,25 / … = … donc N = …</w:t>
       </w:r>
     </w:p>
     <w:p>
@@ -450,7 +617,7 @@
           <w:sz w:val="21"/>
           <w:szCs w:val="21"/>
         </w:rPr>
-        <w:t xml:space="preserve">Pendant la simulation, clique sur le potentiomètre et tourne-le. Le </w:t>
+        <w:t xml:space="preserve">Pendant la simulation, clique sur le potentiomètre et tourne-le (avec la souris ou les flèches du clavier). Le </w:t>
       </w:r>
       <w:r>
         <w:rPr>
@@ -474,36 +641,23 @@
           <w:sz w:val="21"/>
           <w:szCs w:val="21"/>
         </w:rPr>
-        <w:t xml:space="preserve"> (en bas à droite) affiche le code N ; pour l'instant, V et C valent 0, c'est normal.</w:t>
-      </w:r>
-    </w:p>
-    <w:p>
-      <w:pPr>
-        <w:spacing w:after="60"/>
-      </w:pPr>
-      <w:r>
-        <w:rPr>
-          <w:rFonts w:ascii="Arial" w:cs="Arial" w:eastAsia="Arial" w:hAnsi="Arial"/>
-          <w:b/>
-          <w:bCs/>
-          <w:i/>
-          <w:iCs/>
-          <w:color w:val="64748B"/>
-          <w:sz w:val="21"/>
-          <w:szCs w:val="21"/>
-        </w:rPr>
-        <w:t xml:space="preserve">a)</w:t>
-      </w:r>
-      <w:r>
-        <w:rPr>
-          <w:rFonts w:ascii="Arial" w:cs="Arial" w:eastAsia="Arial" w:hAnsi="Arial"/>
-          <w:i/>
-          <w:iCs/>
-          <w:color w:val="64748B"/>
-          <w:sz w:val="21"/>
-          <w:szCs w:val="21"/>
-        </w:rPr>
-        <w:t xml:space="preserve"> Quel code N obtiens-tu potentiomètre tourné à fond à gauche, puis à fond à droite ? Pourquoi la valeur maximale est-elle celle-ci ?</w:t>
+        <w:t xml:space="preserve">, en bas à droite, affiche le code N. Pour l'instant, V et C valent 0, c'est normal.</w:t>
+      </w:r>
+    </w:p>
+    <w:p>
+      <w:pPr>
+        <w:spacing w:after="60"/>
+      </w:pPr>
+      <w:r>
+        <w:rPr>
+          <w:rFonts w:ascii="Arial" w:cs="Arial" w:eastAsia="Arial" w:hAnsi="Arial"/>
+          <w:i/>
+          <w:iCs/>
+          <w:color w:val="64748B"/>
+          <w:sz w:val="21"/>
+          <w:szCs w:val="21"/>
+        </w:rPr>
+        <w:t xml:space="preserve">Quel code N obtiens-tu potentiomètre tourné à fond dans un sens, puis à fond dans l'autre ? Compare avec ta réponse à la question 2a.</w:t>
       </w:r>
     </w:p>
     <w:p>
@@ -651,18 +805,18 @@
           <w:sz w:val="21"/>
           <w:szCs w:val="21"/>
         </w:rPr>
-        <w:t xml:space="preserve">sketch.ino</w:t>
-      </w:r>
-      <w:r>
-        <w:rPr>
-          <w:rFonts w:ascii="Arial" w:cs="Arial" w:eastAsia="Arial" w:hAnsi="Arial"/>
-          <w:i/>
-          <w:iCs/>
-          <w:color w:val="64748B"/>
-          <w:sz w:val="21"/>
-          <w:szCs w:val="21"/>
-        </w:rPr>
-        <w:t xml:space="preserve">, complète les deux lignes </w:t>
+        <w:t xml:space="preserve">main.py</w:t>
+      </w:r>
+      <w:r>
+        <w:rPr>
+          <w:rFonts w:ascii="Arial" w:cs="Arial" w:eastAsia="Arial" w:hAnsi="Arial"/>
+          <w:i/>
+          <w:iCs/>
+          <w:color w:val="64748B"/>
+          <w:sz w:val="21"/>
+          <w:szCs w:val="21"/>
+        </w:rPr>
+        <w:t xml:space="preserve">, remplace les deux lignes </w:t>
       </w:r>
       <w:r>
         <w:rPr>
@@ -673,6 +827,50 @@
           <w:sz w:val="21"/>
           <w:szCs w:val="21"/>
         </w:rPr>
+        <w:t xml:space="preserve">v = 0</w:t>
+      </w:r>
+      <w:r>
+        <w:rPr>
+          <w:rFonts w:ascii="Arial" w:cs="Arial" w:eastAsia="Arial" w:hAnsi="Arial"/>
+          <w:i/>
+          <w:iCs/>
+          <w:color w:val="64748B"/>
+          <w:sz w:val="21"/>
+          <w:szCs w:val="21"/>
+        </w:rPr>
+        <w:t xml:space="preserve"> et </w:t>
+      </w:r>
+      <w:r>
+        <w:rPr>
+          <w:rFonts w:ascii="Consolas" w:cs="Consolas" w:eastAsia="Consolas" w:hAnsi="Consolas"/>
+          <w:i/>
+          <w:iCs/>
+          <w:color w:val="64748B"/>
+          <w:sz w:val="21"/>
+          <w:szCs w:val="21"/>
+        </w:rPr>
+        <w:t xml:space="preserve">c = 0</w:t>
+      </w:r>
+      <w:r>
+        <w:rPr>
+          <w:rFonts w:ascii="Arial" w:cs="Arial" w:eastAsia="Arial" w:hAnsi="Arial"/>
+          <w:i/>
+          <w:iCs/>
+          <w:color w:val="64748B"/>
+          <w:sz w:val="21"/>
+          <w:szCs w:val="21"/>
+        </w:rPr>
+        <w:t xml:space="preserve"> (sous les </w:t>
+      </w:r>
+      <w:r>
+        <w:rPr>
+          <w:rFonts w:ascii="Consolas" w:cs="Consolas" w:eastAsia="Consolas" w:hAnsi="Consolas"/>
+          <w:i/>
+          <w:iCs/>
+          <w:color w:val="64748B"/>
+          <w:sz w:val="21"/>
+          <w:szCs w:val="21"/>
+        </w:rPr>
         <w:t xml:space="preserve">TODO Q4</w:t>
       </w:r>
       <w:r>
@@ -684,177 +882,7 @@
           <w:sz w:val="21"/>
           <w:szCs w:val="21"/>
         </w:rPr>
-        <w:t xml:space="preserve"> pour calculer la tension </w:t>
-      </w:r>
-      <w:r>
-        <w:rPr>
-          <w:rFonts w:ascii="Consolas" w:cs="Consolas" w:eastAsia="Consolas" w:hAnsi="Consolas"/>
-          <w:i/>
-          <w:iCs/>
-          <w:color w:val="64748B"/>
-          <w:sz w:val="21"/>
-          <w:szCs w:val="21"/>
-        </w:rPr>
-        <w:t xml:space="preserve">v</w:t>
-      </w:r>
-      <w:r>
-        <w:rPr>
-          <w:rFonts w:ascii="Arial" w:cs="Arial" w:eastAsia="Arial" w:hAnsi="Arial"/>
-          <w:i/>
-          <w:iCs/>
-          <w:color w:val="64748B"/>
-          <w:sz w:val="21"/>
-          <w:szCs w:val="21"/>
-        </w:rPr>
-        <w:t xml:space="preserve"> (en V) à partir du code </w:t>
-      </w:r>
-      <w:r>
-        <w:rPr>
-          <w:rFonts w:ascii="Consolas" w:cs="Consolas" w:eastAsia="Consolas" w:hAnsi="Consolas"/>
-          <w:i/>
-          <w:iCs/>
-          <w:color w:val="64748B"/>
-          <w:sz w:val="21"/>
-          <w:szCs w:val="21"/>
-        </w:rPr>
-        <w:t xml:space="preserve">n</w:t>
-      </w:r>
-      <w:r>
-        <w:rPr>
-          <w:rFonts w:ascii="Arial" w:cs="Arial" w:eastAsia="Arial" w:hAnsi="Arial"/>
-          <w:i/>
-          <w:iCs/>
-          <w:color w:val="64748B"/>
-          <w:sz w:val="21"/>
-          <w:szCs w:val="21"/>
-        </w:rPr>
-        <w:t xml:space="preserve">, puis la concentration </w:t>
-      </w:r>
-      <w:r>
-        <w:rPr>
-          <w:rFonts w:ascii="Consolas" w:cs="Consolas" w:eastAsia="Consolas" w:hAnsi="Consolas"/>
-          <w:i/>
-          <w:iCs/>
-          <w:color w:val="64748B"/>
-          <w:sz w:val="21"/>
-          <w:szCs w:val="21"/>
-        </w:rPr>
-        <w:t xml:space="preserve">c</w:t>
-      </w:r>
-      <w:r>
-        <w:rPr>
-          <w:rFonts w:ascii="Arial" w:cs="Arial" w:eastAsia="Arial" w:hAnsi="Arial"/>
-          <w:i/>
-          <w:iCs/>
-          <w:color w:val="64748B"/>
-          <w:sz w:val="21"/>
-          <w:szCs w:val="21"/>
-        </w:rPr>
-        <w:t xml:space="preserve"> (en ppm) à partir de </w:t>
-      </w:r>
-      <w:r>
-        <w:rPr>
-          <w:rFonts w:ascii="Consolas" w:cs="Consolas" w:eastAsia="Consolas" w:hAnsi="Consolas"/>
-          <w:i/>
-          <w:iCs/>
-          <w:color w:val="64748B"/>
-          <w:sz w:val="21"/>
-          <w:szCs w:val="21"/>
-        </w:rPr>
-        <w:t xml:space="preserve">v</w:t>
-      </w:r>
-      <w:r>
-        <w:rPr>
-          <w:rFonts w:ascii="Arial" w:cs="Arial" w:eastAsia="Arial" w:hAnsi="Arial"/>
-          <w:i/>
-          <w:iCs/>
-          <w:color w:val="64748B"/>
-          <w:sz w:val="21"/>
-          <w:szCs w:val="21"/>
-        </w:rPr>
-        <w:t xml:space="preserve">. Relance la simulation et tourne le potentiomètre pour obtenir environ 420 ppm.</w:t>
-      </w:r>
-    </w:p>
-    <w:p>
-      <w:pPr>
-        <w:spacing w:after="60"/>
-      </w:pPr>
-      <w:r>
-        <w:rPr>
-          <w:rFonts w:ascii="Arial" w:cs="Arial" w:eastAsia="Arial" w:hAnsi="Arial"/>
-          <w:i/>
-          <w:iCs/>
-          <w:color w:val="64748B"/>
-          <w:sz w:val="21"/>
-          <w:szCs w:val="21"/>
-        </w:rPr>
-        <w:t xml:space="preserve">Aide : V = N × q = N × PE / (nombre de codes), puis C = V / s. Les constantes </w:t>
-      </w:r>
-      <w:r>
-        <w:rPr>
-          <w:rFonts w:ascii="Consolas" w:cs="Consolas" w:eastAsia="Consolas" w:hAnsi="Consolas"/>
-          <w:i/>
-          <w:iCs/>
-          <w:color w:val="64748B"/>
-          <w:sz w:val="21"/>
-          <w:szCs w:val="21"/>
-        </w:rPr>
-        <w:t xml:space="preserve">PLEINE_ECHELLE</w:t>
-      </w:r>
-      <w:r>
-        <w:rPr>
-          <w:rFonts w:ascii="Arial" w:cs="Arial" w:eastAsia="Arial" w:hAnsi="Arial"/>
-          <w:i/>
-          <w:iCs/>
-          <w:color w:val="64748B"/>
-          <w:sz w:val="21"/>
-          <w:szCs w:val="21"/>
-        </w:rPr>
-        <w:t xml:space="preserve">, </w:t>
-      </w:r>
-      <w:r>
-        <w:rPr>
-          <w:rFonts w:ascii="Consolas" w:cs="Consolas" w:eastAsia="Consolas" w:hAnsi="Consolas"/>
-          <w:i/>
-          <w:iCs/>
-          <w:color w:val="64748B"/>
-          <w:sz w:val="21"/>
-          <w:szCs w:val="21"/>
-        </w:rPr>
-        <w:t xml:space="preserve">NB_CODES</w:t>
-      </w:r>
-      <w:r>
-        <w:rPr>
-          <w:rFonts w:ascii="Arial" w:cs="Arial" w:eastAsia="Arial" w:hAnsi="Arial"/>
-          <w:i/>
-          <w:iCs/>
-          <w:color w:val="64748B"/>
-          <w:sz w:val="21"/>
-          <w:szCs w:val="21"/>
-        </w:rPr>
-        <w:t xml:space="preserve"> et </w:t>
-      </w:r>
-      <w:r>
-        <w:rPr>
-          <w:rFonts w:ascii="Consolas" w:cs="Consolas" w:eastAsia="Consolas" w:hAnsi="Consolas"/>
-          <w:i/>
-          <w:iCs/>
-          <w:color w:val="64748B"/>
-          <w:sz w:val="21"/>
-          <w:szCs w:val="21"/>
-        </w:rPr>
-        <w:t xml:space="preserve">SENSIBILITE</w:t>
-      </w:r>
-      <w:r>
-        <w:rPr>
-          <w:rFonts w:ascii="Arial" w:cs="Arial" w:eastAsia="Arial" w:hAnsi="Arial"/>
-          <w:i/>
-          <w:iCs/>
-          <w:color w:val="64748B"/>
-          <w:sz w:val="21"/>
-          <w:szCs w:val="21"/>
-        </w:rPr>
-        <w:t xml:space="preserve"> sont déjà écrites en haut du programme.</w:t>
+        <w:t xml:space="preserve">) par les bons calculs. Relance la simulation et tourne le potentiomètre pour obtenir environ 420 ppm.</w:t>
       </w:r>
     </w:p>
     <w:p>
@@ -1028,7 +1056,7 @@
           <w:sz w:val="21"/>
           <w:szCs w:val="21"/>
         </w:rPr>
-        <w:t xml:space="preserve"> Complète la zone </w:t>
+        <w:t xml:space="preserve"> Sous le </w:t>
       </w:r>
       <w:r>
         <w:rPr>
@@ -1050,7 +1078,7 @@
           <w:sz w:val="21"/>
           <w:szCs w:val="21"/>
         </w:rPr>
-        <w:t xml:space="preserve"> pour que la LED « L » de la carte s'allume quand </w:t>
+        <w:t xml:space="preserve">, écris la condition qui allume le voyant quand </w:t>
       </w:r>
       <w:r>
         <w:rPr>
@@ -1094,7 +1122,51 @@
           <w:sz w:val="21"/>
           <w:szCs w:val="21"/>
         </w:rPr>
-        <w:t xml:space="preserve">, et s'éteigne sinon.</w:t>
+        <w:t xml:space="preserve">, et l'éteint sinon. Attention à l'indentation (4 espaces dans la boucle, 8 sous le </w:t>
+      </w:r>
+      <w:r>
+        <w:rPr>
+          <w:rFonts w:ascii="Consolas" w:cs="Consolas" w:eastAsia="Consolas" w:hAnsi="Consolas"/>
+          <w:i/>
+          <w:iCs/>
+          <w:color w:val="64748B"/>
+          <w:sz w:val="21"/>
+          <w:szCs w:val="21"/>
+        </w:rPr>
+        <w:t xml:space="preserve">if</w:t>
+      </w:r>
+      <w:r>
+        <w:rPr>
+          <w:rFonts w:ascii="Arial" w:cs="Arial" w:eastAsia="Arial" w:hAnsi="Arial"/>
+          <w:i/>
+          <w:iCs/>
+          <w:color w:val="64748B"/>
+          <w:sz w:val="21"/>
+          <w:szCs w:val="21"/>
+        </w:rPr>
+        <w:t xml:space="preserve"> et le </w:t>
+      </w:r>
+      <w:r>
+        <w:rPr>
+          <w:rFonts w:ascii="Consolas" w:cs="Consolas" w:eastAsia="Consolas" w:hAnsi="Consolas"/>
+          <w:i/>
+          <w:iCs/>
+          <w:color w:val="64748B"/>
+          <w:sz w:val="21"/>
+          <w:szCs w:val="21"/>
+        </w:rPr>
+        <w:t xml:space="preserve">else</w:t>
+      </w:r>
+      <w:r>
+        <w:rPr>
+          <w:rFonts w:ascii="Arial" w:cs="Arial" w:eastAsia="Arial" w:hAnsi="Arial"/>
+          <w:i/>
+          <w:iCs/>
+          <w:color w:val="64748B"/>
+          <w:sz w:val="21"/>
+          <w:szCs w:val="21"/>
+        </w:rPr>
+        <w:t xml:space="preserve">).</w:t>
       </w:r>
     </w:p>
     <w:p>
@@ -1147,7 +1219,55 @@
           <w:sz w:val="21"/>
           <w:szCs w:val="21"/>
         </w:rPr>
-        <w:t xml:space="preserve"> le potentiomètre autour du seuil et note le code N pour lequel la LED s'allume. Compare-le à ta prévision de la question 2.</w:t>
+        <w:t xml:space="preserve"> le potentiomètre autour du seuil. Note le code N et la concentration juste </w:t>
+      </w:r>
+      <w:r>
+        <w:rPr>
+          <w:rFonts w:ascii="Arial" w:cs="Arial" w:eastAsia="Arial" w:hAnsi="Arial"/>
+          <w:b/>
+          <w:bCs/>
+          <w:i/>
+          <w:iCs/>
+          <w:color w:val="64748B"/>
+          <w:sz w:val="21"/>
+          <w:szCs w:val="21"/>
+        </w:rPr>
+        <w:t xml:space="preserve">avant</w:t>
+      </w:r>
+      <w:r>
+        <w:rPr>
+          <w:rFonts w:ascii="Arial" w:cs="Arial" w:eastAsia="Arial" w:hAnsi="Arial"/>
+          <w:i/>
+          <w:iCs/>
+          <w:color w:val="64748B"/>
+          <w:sz w:val="21"/>
+          <w:szCs w:val="21"/>
+        </w:rPr>
+        <w:t xml:space="preserve"> et juste </w:t>
+      </w:r>
+      <w:r>
+        <w:rPr>
+          <w:rFonts w:ascii="Arial" w:cs="Arial" w:eastAsia="Arial" w:hAnsi="Arial"/>
+          <w:b/>
+          <w:bCs/>
+          <w:i/>
+          <w:iCs/>
+          <w:color w:val="64748B"/>
+          <w:sz w:val="21"/>
+          <w:szCs w:val="21"/>
+        </w:rPr>
+        <w:t xml:space="preserve">après</w:t>
+      </w:r>
+      <w:r>
+        <w:rPr>
+          <w:rFonts w:ascii="Arial" w:cs="Arial" w:eastAsia="Arial" w:hAnsi="Arial"/>
+          <w:i/>
+          <w:iCs/>
+          <w:color w:val="64748B"/>
+          <w:sz w:val="21"/>
+          <w:szCs w:val="21"/>
+        </w:rPr>
+        <w:t xml:space="preserve"> l'allumage du voyant. Ta prévision de la question 2c est-elle entre les deux ?</w:t>
       </w:r>
     </w:p>
     <w:p>
@@ -1187,7 +1307,7 @@
           <w:sz w:val="21"/>
           <w:szCs w:val="21"/>
         </w:rPr>
-        <w:t xml:space="preserve"> : la LED « L » allumée et le moniteur série juste au-dessus de 1 500 ppm. </w:t>
+        <w:t xml:space="preserve"> : le voyant allumé et le moniteur série juste au-dessus de 1 500 ppm. </w:t>
       </w:r>
       <w:r>
         <w:rPr>
@@ -1321,7 +1441,7 @@
           <w:sz w:val="21"/>
           <w:szCs w:val="21"/>
         </w:rPr>
-        <w:t xml:space="preserve"> Calcule la </w:t>
+        <w:t xml:space="preserve"> La </w:t>
       </w:r>
       <w:r>
         <w:rPr>
@@ -1345,7 +1465,7 @@
           <w:sz w:val="21"/>
           <w:szCs w:val="21"/>
         </w:rPr>
-        <w:t xml:space="preserve"> de la chaîne en ppm, c'est-à-dire la plus petite variation de CO₂ qu'elle peut détecter : q / s.</w:t>
+        <w:t xml:space="preserve"> de la chaîne est la plus petite variation de CO₂ qu'elle peut détecter : q / s. Calcule-la en ppm, avec q en mV (question 2b) et s en mV/ppm (question 1c).</w:t>
       </w:r>
     </w:p>
     <w:p>
@@ -1374,36 +1494,7 @@
           <w:sz w:val="21"/>
           <w:szCs w:val="21"/>
         </w:rPr>
-        <w:t xml:space="preserve"> Est-elle suffisante pour un voyant qui s'allume à 1 500 ppm ? Justifie en une phrase.</w:t>
-      </w:r>
-    </w:p>
-    <w:p>
-      <w:pPr>
-        <w:spacing w:after="60"/>
-      </w:pPr>
-      <w:r>
-        <w:rPr>
-          <w:rFonts w:ascii="Arial" w:cs="Arial" w:eastAsia="Arial" w:hAnsi="Arial"/>
-          <w:b/>
-          <w:bCs/>
-          <w:i/>
-          <w:iCs/>
-          <w:color w:val="64748B"/>
-          <w:sz w:val="21"/>
-          <w:szCs w:val="21"/>
-        </w:rPr>
-        <w:t xml:space="preserve">c)</w:t>
-      </w:r>
-      <w:r>
-        <w:rPr>
-          <w:rFonts w:ascii="Arial" w:cs="Arial" w:eastAsia="Arial" w:hAnsi="Arial"/>
-          <w:i/>
-          <w:iCs/>
-          <w:color w:val="64748B"/>
-          <w:sz w:val="21"/>
-          <w:szCs w:val="21"/>
-        </w:rPr>
-        <w:t xml:space="preserve"> Potentiomètre à fond, le programme affiche environ 2 500 ppm. Pourquoi cette valeur n'a-t-elle pas de sens avec le vrai capteur du DR1 ?</w:t>
+        <w:t xml:space="preserve"> Potentiomètre à fond, le programme affiche environ 2 200 ppm. Pourquoi cette valeur n'a-t-elle pas de sens avec le vrai capteur du DR1 ?</w:t>
       </w:r>
     </w:p>
     <w:p>
@@ -1526,20 +1617,33 @@
           <w:sz w:val="21"/>
           <w:szCs w:val="21"/>
         </w:rPr>
-        <w:t xml:space="preserve">• Le programme fait le chemin inverse : V = N × q, puis C = V / s, où s est la …………… du capteur.</w:t>
-      </w:r>
-    </w:p>
-    <w:p>
-      <w:pPr>
-        <w:spacing w:after="60"/>
-      </w:pPr>
-      <w:r>
-        <w:rPr>
-          <w:rFonts w:ascii="Arial" w:cs="Arial" w:eastAsia="Arial" w:hAnsi="Arial"/>
-          <w:sz w:val="21"/>
-          <w:szCs w:val="21"/>
-        </w:rPr>
-        <w:t xml:space="preserve">• La résolution de la chaîne en ppm vaut q / s : la décision « Aérez ! » se fait à un …………… près.</w:t>
+        <w:t xml:space="preserve">• La sensibilité d'un capteur vaut s = ΔV / ΔC ; le quantum du CAN vaut q = PE / 2ⁿ.</w:t>
+      </w:r>
+    </w:p>
+    <w:p>
+      <w:pPr>
+        <w:spacing w:after="60"/>
+      </w:pPr>
+      <w:r>
+        <w:rPr>
+          <w:rFonts w:ascii="Arial" w:cs="Arial" w:eastAsia="Arial" w:hAnsi="Arial"/>
+          <w:sz w:val="21"/>
+          <w:szCs w:val="21"/>
+        </w:rPr>
+        <w:t xml:space="preserve">• Le programme fait le chemin inverse : V = N × q, puis C = V / s.</w:t>
+      </w:r>
+    </w:p>
+    <w:p>
+      <w:pPr>
+        <w:spacing w:after="60"/>
+      </w:pPr>
+      <w:r>
+        <w:rPr>
+          <w:rFonts w:ascii="Arial" w:cs="Arial" w:eastAsia="Arial" w:hAnsi="Arial"/>
+          <w:sz w:val="21"/>
+          <w:szCs w:val="21"/>
+        </w:rPr>
+        <w:t xml:space="preserve">• La résolution de la chaîne en ppm vaut q / s : le voyant se déclenche à un …………… près.</w:t>
       </w:r>
     </w:p>
     <w:sectPr>

</xml_diff>